<commit_message>
Tarea 1.6: explain PM10/PM2.5 (definition, sources, health, WHO guidelines) and interpret coefficients
</commit_message>
<xml_diff>
--- a/3er-semestre/visualizacion-grandes-bases-datos/tareas/Tarea1_6/Tarea1_6_VisualizacionGBD_CarlosPulidoRosas.docx
+++ b/3er-semestre/visualizacion-grandes-bases-datos/tareas/Tarea1_6/Tarea1_6_VisualizacionGBD_CarlosPulidoRosas.docx
@@ -2970,7 +2970,72 @@
           <w:color w:val="1F497D"/>
           <w:sz w:val="22"/>
         </w:rPr>
-        <w:t>3.1 Corpus de análisis</w:t>
+        <w:t>3.1 Las partículas PM10 y PM2.5</w:t>
+      </w:r>
+    </w:p>
+    <w:p>
+      <w:pPr>
+        <w:keepNext w:val="0"/>
+        <w:spacing w:before="0" w:after="100"/>
+        <w:jc w:val="both"/>
+      </w:pPr>
+      <w:r>
+        <w:rPr>
+          <w:rFonts w:ascii="Calibri" w:hAnsi="Calibri"/>
+          <w:b w:val="0"/>
+          <w:i w:val="0"/>
+          <w:sz w:val="20"/>
+        </w:rPr>
+        <w:t>Las partículas suspendidas, o material particulado (PM, por sus siglas en inglés), son una mezcla de partículas sólidas y gotas líquidas que permanecen en el aire. Se clasifican por su diámetro aerodinámico: el PM10 agrupa a las partículas de 10 µm o menos y el PM2.5 a las de 2.5 µm o menos, unas treinta veces más delgadas que un cabello humano. Por definición, el PM2.5 es una fracción del PM10; la diferencia entre ambos corresponde a la llamada fracción gruesa, de entre 2.5 y 10 µm. A diferencia del NO₂ o del CO, que son gases, ambas se miden en masa por volumen de aire (µg/m³) (Seinfeld y Pandis, 2016).</w:t>
+      </w:r>
+    </w:p>
+    <w:p>
+      <w:pPr>
+        <w:keepNext w:val="0"/>
+        <w:spacing w:before="0" w:after="100"/>
+        <w:jc w:val="both"/>
+      </w:pPr>
+      <w:r>
+        <w:rPr>
+          <w:rFonts w:ascii="Calibri" w:hAnsi="Calibri"/>
+          <w:b w:val="0"/>
+          <w:i w:val="0"/>
+          <w:sz w:val="20"/>
+        </w:rPr>
+        <w:t>Sus fuentes son distintas. La fracción gruesa proviene sobre todo de procesos mecánicos: polvo resuspendido por el viento y el tránsito en calles sin pavimentar, construcción, erosión del suelo y desgaste de llantas y frenos. El PM2.5, en cambio, se origina principalmente en la combustión (motores, en particular los de diésel, quemas agrícolas e industria) y en la formación secundaria, es decir, en partículas que se forman en la atmósfera a partir de gases precursores. Entre esos precursores están los óxidos de nitrógeno: el NO₂ se oxida a ácido nítrico, que al reaccionar con el amoniaco forma nitrato de amonio, una sal que pasa a formar parte del PM2.5 (Seinfeld y Pandis, 2016). Por eso se espera que el NO₂ se relacione con las partículas finas a través de dos vías: la fuente vehicular que comparten y la química atmosférica.</w:t>
+      </w:r>
+    </w:p>
+    <w:p>
+      <w:pPr>
+        <w:keepNext w:val="0"/>
+        <w:spacing w:before="0" w:after="100"/>
+        <w:jc w:val="both"/>
+      </w:pPr>
+      <w:r>
+        <w:rPr>
+          <w:rFonts w:ascii="Calibri" w:hAnsi="Calibri"/>
+          <w:b w:val="0"/>
+          <w:i w:val="0"/>
+          <w:sz w:val="20"/>
+        </w:rPr>
+        <w:t>Su efecto en la salud depende del tamaño. El PM10 llega a las vías respiratorias superiores y a los bronquios, mientras que el PM2.5 alcanza los alvéolos pulmonares y puede pasar al torrente sanguíneo, por lo que se asocia con enfermedades respiratorias, cardiovasculares y con mortalidad prematura. La Organización Mundial de la Salud (OMS, 2021) recomienda que el promedio de 24 horas no rebase 45 µg/m³ de PM10 ni 15 µg/m³ de PM2.5. En la estación Centro, durante 2024, el PM10 promedió 40.1 µg/m³ y el PM2.5 17.1 µg/m³; el promedio diario superó la recomendación de la OMS en 123 de 350 días para el PM10 y en 155 de 336 días para el PM2.5. La mediana del cociente PM2.5/PM10 es de 0.41, lo que indica que algo menos de la mitad de la masa de partículas en esta estación corresponde a la fracción fina.</w:t>
+      </w:r>
+    </w:p>
+    <w:p>
+      <w:pPr>
+        <w:keepNext/>
+        <w:spacing w:before="140" w:after="60"/>
+        <w:jc w:val="left"/>
+      </w:pPr>
+      <w:r>
+        <w:rPr>
+          <w:rFonts w:ascii="Calibri" w:hAnsi="Calibri"/>
+          <w:b/>
+          <w:i w:val="0"/>
+          <w:color w:val="1F497D"/>
+          <w:sz w:val="22"/>
+        </w:rPr>
+        <w:t>3.2 Corpus de análisis</w:t>
       </w:r>
     </w:p>
     <w:p>
@@ -3003,7 +3068,7 @@
           <w:color w:val="1F497D"/>
           <w:sz w:val="22"/>
         </w:rPr>
-        <w:t>3.2 Dispersión entre las variables y colinealidad</w:t>
+        <w:t>3.3 Dispersión entre las variables y colinealidad</w:t>
       </w:r>
     </w:p>
     <w:p>
@@ -3467,7 +3532,7 @@
           <w:color w:val="1F497D"/>
           <w:sz w:val="22"/>
         </w:rPr>
-        <w:t>3.3 Modelos de regresión lineal múltiple</w:t>
+        <w:t>3.4 Modelos de regresión lineal múltiple</w:t>
       </w:r>
     </w:p>
     <w:p>
@@ -4732,6 +4797,22 @@
           <w:sz w:val="18"/>
         </w:rPr>
         <w:t>Figura 4. Plano de regresión lineal múltiple y superficie del modelo cuadrático del NO₂ en función del PM10 y el PM2.5, serie completada (muestra de 1,500 horas).</w:t>
+      </w:r>
+    </w:p>
+    <w:p>
+      <w:pPr>
+        <w:keepNext w:val="0"/>
+        <w:spacing w:before="0" w:after="100"/>
+        <w:jc w:val="both"/>
+      </w:pPr>
+      <w:r>
+        <w:rPr>
+          <w:rFonts w:ascii="Calibri" w:hAnsi="Calibri"/>
+          <w:b w:val="0"/>
+          <w:i w:val="0"/>
+          <w:sz w:val="20"/>
+        </w:rPr>
+        <w:t>Los coeficientes se leen como el cambio esperado en el NO₂ por cada µg/m³ adicional de partículas. Con los datos observados, un aumento de 10 µg/m³ de PM10 se asocia con 3.5 ppb más de NO₂, y uno de 10 µg/m³ de PM2.5 con 7.2 ppb, frente a un promedio de 18.3 ppb de NO₂ en esas horas. El coeficiente del PM2.5 es mayor porque sus concentraciones son más bajas, de modo que 10 µg/m³ representan un cambio relativo más grande. Estas cifras no significan que las partículas produzcan NO₂: ambas variables aumentan juntas porque comparten fuentes de combustión y porque se acumulan bajo las mismas condiciones meteorológicas, como las inversiones térmicas y la falta de viento.</w:t>
       </w:r>
     </w:p>
     <w:p>
@@ -4951,6 +5032,22 @@
           <w:sz w:val="20"/>
         </w:rPr>
         <w:t>Montgomery, D. C., Peck, E. A., &amp; Vining, G. G. (2021). Introduction to linear regression analysis (6.ª ed.). Wiley.</w:t>
+      </w:r>
+    </w:p>
+    <w:p>
+      <w:pPr>
+        <w:spacing w:after="120"/>
+        <w:ind w:left="720" w:hanging="720"/>
+        <w:jc w:val="both"/>
+      </w:pPr>
+      <w:r>
+        <w:rPr>
+          <w:rFonts w:ascii="Calibri" w:hAnsi="Calibri"/>
+          <w:b w:val="0"/>
+          <w:i w:val="0"/>
+          <w:sz w:val="20"/>
+        </w:rPr>
+        <w:t>Organización Mundial de la Salud. (2021). WHO global air quality guidelines: Particulate matter (PM2.5 and PM10), ozone, nitrogen dioxide, sulfur dioxide and carbon monoxide. World Health Organization. https://iris.who.int/handle/10665/345329</w:t>
       </w:r>
     </w:p>
     <w:p>

</xml_diff>

<commit_message>
Tarea 1.6: fine/coarse PM decomposition, daily cycle and network-wide NO2 gap
</commit_message>
<xml_diff>
--- a/3er-semestre/visualizacion-grandes-bases-datos/tareas/Tarea1_6/Tarea1_6_VisualizacionGBD_CarlosPulidoRosas.docx
+++ b/3er-semestre/visualizacion-grandes-bases-datos/tareas/Tarea1_6/Tarea1_6_VisualizacionGBD_CarlosPulidoRosas.docx
@@ -610,6 +610,22 @@
           <w:sz w:val="20"/>
         </w:rPr>
         <w:t>En las tareas anteriores el NOx tuvo la correlación más alta con el NO₂, pero no puede usarse para imputar por dos razones: contiene al NO₂ en su cálculo y le faltan exactamente las mismas horas, porque ambos se miden con el mismo analizador. El CO es el contaminante independiente con mayor correlación (r = 0.909 en la Tarea 1.5) y además tiene cobertura casi anual. Con él se pueden imputar 5,711 de las 6,078 horas faltantes; las 367 restantes tampoco tienen lectura de CO y se dejaron sin imputar, para no encadenar una estimación sobre otra.</w:t>
+      </w:r>
+    </w:p>
+    <w:p>
+      <w:pPr>
+        <w:keepNext w:val="0"/>
+        <w:spacing w:before="0" w:after="100"/>
+        <w:jc w:val="both"/>
+      </w:pPr>
+      <w:r>
+        <w:rPr>
+          <w:rFonts w:ascii="Calibri" w:hAnsi="Calibri"/>
+          <w:b w:val="0"/>
+          <w:i w:val="0"/>
+          <w:sz w:val="20"/>
+        </w:rPr>
+        <w:t>El vacío no es exclusivo de esta estación. De las 13 estaciones de la red SIMAJ en la base de 2024, 12 registran NO₂ y ninguna lo hace antes de agosto, de modo que el hueco de enero a julio afecta a toda la red. Esto justifica estimar los valores faltantes a partir de otro contaminante, pero también impide validar la imputación contra una estación vecina.</w:t>
       </w:r>
     </w:p>
     <w:p>
@@ -4923,6 +4939,535 @@
     <w:p>
       <w:pPr>
         <w:keepNext/>
+        <w:spacing w:before="140" w:after="60"/>
+        <w:jc w:val="left"/>
+      </w:pPr>
+      <w:r>
+        <w:rPr>
+          <w:rFonts w:ascii="Calibri" w:hAnsi="Calibri"/>
+          <w:b/>
+          <w:i w:val="0"/>
+          <w:color w:val="1F497D"/>
+          <w:sz w:val="22"/>
+        </w:rPr>
+        <w:t>3.5 Fracción fina y fracción gruesa</w:t>
+      </w:r>
+    </w:p>
+    <w:p>
+      <w:pPr>
+        <w:keepNext/>
+        <w:spacing w:before="0" w:after="100"/>
+        <w:jc w:val="both"/>
+      </w:pPr>
+      <w:r>
+        <w:rPr>
+          <w:rFonts w:ascii="Calibri" w:hAnsi="Calibri"/>
+          <w:b w:val="0"/>
+          <w:i w:val="0"/>
+          <w:sz w:val="20"/>
+        </w:rPr>
+        <w:t>La colinealidad entre el PM10 y el PM2.5 tiene una causa conocida: el PM10 contiene al PM2.5. Por eso puede eliminarse sin quitar información, separando el PM10 en sus dos componentes, la fracción fina (PM2.5) y la fracción gruesa (PM10 − PM2.5), y ajustando NO₂ = b₀ + b₁·PM2.5 + b₂·(PM10 − PM2.5). Este modelo tiene exactamente el mismo ajuste que el lineal múltiple de la Tabla 4, porque usa la misma información, pero sus dos variables ya no comparten partículas. La correlación entre ellas baja a 0.677 con datos observados y el VIF a 1.84 (Tabla 5).</w:t>
+      </w:r>
+    </w:p>
+    <w:tbl>
+      <w:tblPr>
+        <w:tblStyle w:val="TableGrid"/>
+        <w:tblW w:type="auto" w:w="0"/>
+        <w:jc w:val="center"/>
+        <w:tblLook w:firstColumn="1" w:firstRow="1" w:lastColumn="0" w:lastRow="0" w:noHBand="0" w:noVBand="1" w:val="04A0"/>
+      </w:tblPr>
+      <w:tblGrid>
+        <w:gridCol w:w="2016"/>
+        <w:gridCol w:w="2016"/>
+        <w:gridCol w:w="2016"/>
+        <w:gridCol w:w="2016"/>
+        <w:gridCol w:w="2016"/>
+      </w:tblGrid>
+      <w:tr>
+        <w:tc>
+          <w:tcPr>
+            <w:tcW w:type="dxa" w:w="1584"/>
+            <w:shd w:val="clear" w:color="auto" w:fill="1F497D"/>
+          </w:tcPr>
+          <w:p>
+            <w:pPr>
+              <w:keepNext/>
+              <w:jc w:val="center"/>
+            </w:pPr>
+            <w:r>
+              <w:rPr>
+                <w:rFonts w:ascii="Calibri" w:hAnsi="Calibri"/>
+                <w:b/>
+                <w:i w:val="0"/>
+                <w:color w:val="FFFFFF"/>
+                <w:sz w:val="18"/>
+              </w:rPr>
+              <w:t>Serie</w:t>
+            </w:r>
+          </w:p>
+        </w:tc>
+        <w:tc>
+          <w:tcPr>
+            <w:tcW w:type="dxa" w:w="2880"/>
+            <w:shd w:val="clear" w:color="auto" w:fill="1F497D"/>
+          </w:tcPr>
+          <w:p>
+            <w:pPr>
+              <w:keepNext/>
+              <w:jc w:val="center"/>
+            </w:pPr>
+            <w:r>
+              <w:rPr>
+                <w:rFonts w:ascii="Calibri" w:hAnsi="Calibri"/>
+                <w:b/>
+                <w:i w:val="0"/>
+                <w:color w:val="FFFFFF"/>
+                <w:sz w:val="18"/>
+              </w:rPr>
+              <w:t>b fracción fina (IC 95 %)</w:t>
+            </w:r>
+          </w:p>
+        </w:tc>
+        <w:tc>
+          <w:tcPr>
+            <w:tcW w:type="dxa" w:w="2880"/>
+            <w:shd w:val="clear" w:color="auto" w:fill="1F497D"/>
+          </w:tcPr>
+          <w:p>
+            <w:pPr>
+              <w:keepNext/>
+              <w:jc w:val="center"/>
+            </w:pPr>
+            <w:r>
+              <w:rPr>
+                <w:rFonts w:ascii="Calibri" w:hAnsi="Calibri"/>
+                <w:b/>
+                <w:i w:val="0"/>
+                <w:color w:val="FFFFFF"/>
+                <w:sz w:val="18"/>
+              </w:rPr>
+              <w:t>b fracción gruesa (IC 95 %)</w:t>
+            </w:r>
+          </w:p>
+        </w:tc>
+        <w:tc>
+          <w:tcPr>
+            <w:tcW w:type="dxa" w:w="864"/>
+            <w:shd w:val="clear" w:color="auto" w:fill="1F497D"/>
+          </w:tcPr>
+          <w:p>
+            <w:pPr>
+              <w:keepNext/>
+              <w:jc w:val="center"/>
+            </w:pPr>
+            <w:r>
+              <w:rPr>
+                <w:rFonts w:ascii="Calibri" w:hAnsi="Calibri"/>
+                <w:b/>
+                <w:i w:val="0"/>
+                <w:color w:val="FFFFFF"/>
+                <w:sz w:val="18"/>
+              </w:rPr>
+              <w:t>R²</w:t>
+            </w:r>
+          </w:p>
+        </w:tc>
+        <w:tc>
+          <w:tcPr>
+            <w:tcW w:type="dxa" w:w="864"/>
+            <w:shd w:val="clear" w:color="auto" w:fill="1F497D"/>
+          </w:tcPr>
+          <w:p>
+            <w:pPr>
+              <w:keepNext/>
+              <w:jc w:val="center"/>
+            </w:pPr>
+            <w:r>
+              <w:rPr>
+                <w:rFonts w:ascii="Calibri" w:hAnsi="Calibri"/>
+                <w:b/>
+                <w:i w:val="0"/>
+                <w:color w:val="FFFFFF"/>
+                <w:sz w:val="18"/>
+              </w:rPr>
+              <w:t>VIF</w:t>
+            </w:r>
+          </w:p>
+        </w:tc>
+      </w:tr>
+      <w:tr>
+        <w:tc>
+          <w:tcPr>
+            <w:tcW w:type="dxa" w:w="1584"/>
+            <w:shd w:val="clear" w:color="auto" w:fill="FCE4B8"/>
+          </w:tcPr>
+          <w:p>
+            <w:pPr>
+              <w:keepNext/>
+              <w:jc w:val="left"/>
+            </w:pPr>
+            <w:r>
+              <w:rPr>
+                <w:rFonts w:ascii="Calibri" w:hAnsi="Calibri"/>
+                <w:b/>
+                <w:i w:val="0"/>
+                <w:sz w:val="18"/>
+              </w:rPr>
+              <w:t>Observada</w:t>
+            </w:r>
+          </w:p>
+        </w:tc>
+        <w:tc>
+          <w:tcPr>
+            <w:tcW w:type="dxa" w:w="2880"/>
+            <w:shd w:val="clear" w:color="auto" w:fill="FCE4B8"/>
+          </w:tcPr>
+          <w:p>
+            <w:pPr>
+              <w:keepNext/>
+              <w:jc w:val="center"/>
+            </w:pPr>
+            <w:r>
+              <w:rPr>
+                <w:rFonts w:ascii="Calibri" w:hAnsi="Calibri"/>
+                <w:b/>
+                <w:i w:val="0"/>
+                <w:sz w:val="18"/>
+              </w:rPr>
+              <w:t>0.392 (0.334 a 0.450)</w:t>
+            </w:r>
+          </w:p>
+        </w:tc>
+        <w:tc>
+          <w:tcPr>
+            <w:tcW w:type="dxa" w:w="2880"/>
+            <w:shd w:val="clear" w:color="auto" w:fill="FCE4B8"/>
+          </w:tcPr>
+          <w:p>
+            <w:pPr>
+              <w:keepNext/>
+              <w:jc w:val="center"/>
+            </w:pPr>
+            <w:r>
+              <w:rPr>
+                <w:rFonts w:ascii="Calibri" w:hAnsi="Calibri"/>
+                <w:b/>
+                <w:i w:val="0"/>
+                <w:sz w:val="18"/>
+              </w:rPr>
+              <w:t>0.323 (0.284 a 0.361)</w:t>
+            </w:r>
+          </w:p>
+        </w:tc>
+        <w:tc>
+          <w:tcPr>
+            <w:tcW w:type="dxa" w:w="864"/>
+            <w:shd w:val="clear" w:color="auto" w:fill="FCE4B8"/>
+          </w:tcPr>
+          <w:p>
+            <w:pPr>
+              <w:keepNext/>
+              <w:jc w:val="center"/>
+            </w:pPr>
+            <w:r>
+              <w:rPr>
+                <w:rFonts w:ascii="Calibri" w:hAnsi="Calibri"/>
+                <w:b/>
+                <w:i w:val="0"/>
+                <w:sz w:val="18"/>
+              </w:rPr>
+              <w:t>0.365</w:t>
+            </w:r>
+          </w:p>
+        </w:tc>
+        <w:tc>
+          <w:tcPr>
+            <w:tcW w:type="dxa" w:w="864"/>
+            <w:shd w:val="clear" w:color="auto" w:fill="FCE4B8"/>
+          </w:tcPr>
+          <w:p>
+            <w:pPr>
+              <w:keepNext/>
+              <w:jc w:val="center"/>
+            </w:pPr>
+            <w:r>
+              <w:rPr>
+                <w:rFonts w:ascii="Calibri" w:hAnsi="Calibri"/>
+                <w:b/>
+                <w:i w:val="0"/>
+                <w:sz w:val="18"/>
+              </w:rPr>
+              <w:t>1.84</w:t>
+            </w:r>
+          </w:p>
+        </w:tc>
+      </w:tr>
+      <w:tr>
+        <w:tc>
+          <w:tcPr>
+            <w:tcW w:type="dxa" w:w="1584"/>
+            <w:shd w:val="clear" w:color="auto" w:fill="F2F2F2"/>
+          </w:tcPr>
+          <w:p>
+            <w:pPr>
+              <w:keepNext/>
+              <w:jc w:val="left"/>
+            </w:pPr>
+            <w:r>
+              <w:rPr>
+                <w:rFonts w:ascii="Calibri" w:hAnsi="Calibri"/>
+                <w:b w:val="0"/>
+                <w:i w:val="0"/>
+                <w:sz w:val="18"/>
+              </w:rPr>
+              <w:t>Completada</w:t>
+            </w:r>
+          </w:p>
+        </w:tc>
+        <w:tc>
+          <w:tcPr>
+            <w:tcW w:type="dxa" w:w="2880"/>
+            <w:shd w:val="clear" w:color="auto" w:fill="F2F2F2"/>
+          </w:tcPr>
+          <w:p>
+            <w:pPr>
+              <w:keepNext/>
+              <w:jc w:val="center"/>
+            </w:pPr>
+            <w:r>
+              <w:rPr>
+                <w:rFonts w:ascii="Calibri" w:hAnsi="Calibri"/>
+                <w:b w:val="0"/>
+                <w:i w:val="0"/>
+                <w:sz w:val="18"/>
+              </w:rPr>
+              <w:t>0.599 (0.564 a 0.633)</w:t>
+            </w:r>
+          </w:p>
+        </w:tc>
+        <w:tc>
+          <w:tcPr>
+            <w:tcW w:type="dxa" w:w="2880"/>
+            <w:shd w:val="clear" w:color="auto" w:fill="F2F2F2"/>
+          </w:tcPr>
+          <w:p>
+            <w:pPr>
+              <w:keepNext/>
+              <w:jc w:val="center"/>
+            </w:pPr>
+            <w:r>
+              <w:rPr>
+                <w:rFonts w:ascii="Calibri" w:hAnsi="Calibri"/>
+                <w:b w:val="0"/>
+                <w:i w:val="0"/>
+                <w:sz w:val="18"/>
+              </w:rPr>
+              <w:t>0.202 (0.179 a 0.225)</w:t>
+            </w:r>
+          </w:p>
+        </w:tc>
+        <w:tc>
+          <w:tcPr>
+            <w:tcW w:type="dxa" w:w="864"/>
+            <w:shd w:val="clear" w:color="auto" w:fill="F2F2F2"/>
+          </w:tcPr>
+          <w:p>
+            <w:pPr>
+              <w:keepNext/>
+              <w:jc w:val="center"/>
+            </w:pPr>
+            <w:r>
+              <w:rPr>
+                <w:rFonts w:ascii="Calibri" w:hAnsi="Calibri"/>
+                <w:b w:val="0"/>
+                <w:i w:val="0"/>
+                <w:sz w:val="18"/>
+              </w:rPr>
+              <w:t>0.317</w:t>
+            </w:r>
+          </w:p>
+        </w:tc>
+        <w:tc>
+          <w:tcPr>
+            <w:tcW w:type="dxa" w:w="864"/>
+            <w:shd w:val="clear" w:color="auto" w:fill="F2F2F2"/>
+          </w:tcPr>
+          <w:p>
+            <w:pPr>
+              <w:keepNext/>
+              <w:jc w:val="center"/>
+            </w:pPr>
+            <w:r>
+              <w:rPr>
+                <w:rFonts w:ascii="Calibri" w:hAnsi="Calibri"/>
+                <w:b w:val="0"/>
+                <w:i w:val="0"/>
+                <w:sz w:val="18"/>
+              </w:rPr>
+              <w:t>1.39</w:t>
+            </w:r>
+          </w:p>
+        </w:tc>
+      </w:tr>
+    </w:tbl>
+    <w:p>
+      <w:pPr>
+        <w:keepNext w:val="0"/>
+        <w:spacing w:before="40" w:after="160"/>
+        <w:jc w:val="center"/>
+      </w:pPr>
+      <w:r>
+        <w:rPr>
+          <w:rFonts w:ascii="Calibri" w:hAnsi="Calibri"/>
+          <w:b w:val="0"/>
+          <w:i/>
+          <w:color w:val="404040"/>
+          <w:sz w:val="18"/>
+        </w:rPr>
+        <w:t>Tabla 5. Modelo del NO₂ con la fracción fina y la fracción gruesa de las partículas (ppb de NO₂ por µg/m³). Todos los coeficientes son significativos al 1 %.</w:t>
+      </w:r>
+    </w:p>
+    <w:p>
+      <w:pPr>
+        <w:keepNext w:val="0"/>
+        <w:spacing w:before="0" w:after="100"/>
+        <w:jc w:val="both"/>
+      </w:pPr>
+      <w:r>
+        <w:rPr>
+          <w:rFonts w:ascii="Calibri" w:hAnsi="Calibri"/>
+          <w:b w:val="0"/>
+          <w:i w:val="0"/>
+          <w:sz w:val="20"/>
+        </w:rPr>
+        <w:t>Con la colinealidad resuelta, los dos coeficientes son significativos y sus intervalos de confianza son estrechos. En los datos observados, cada µg/m³ de partículas finas se asocia con 0.392 ppb de NO₂ y cada µg/m³ de partículas gruesas con 0.323 ppb. Ambas fracciones se relacionan con el NO₂ en magnitud parecida, con una ventaja moderada de la fina, coherente con su origen en la combustión. Este resultado precisa la lectura de la sección anterior: que el PM2.5 dejara de ser significativo junto al PM10 no significa que las partículas finas no se relacionen con el NO₂, sino que no lo hacen mucho más que las gruesas. El coeficiente del PM2.5 en el modelo con PM10 mide justamente esa diferencia entre ambas fracciones. En la serie completada la ventaja de la fracción fina es mayor, lo que de nuevo refleja la imputación con CO, un gas de combustión.</w:t>
+      </w:r>
+    </w:p>
+    <w:p>
+      <w:pPr>
+        <w:keepNext w:val="0"/>
+        <w:spacing w:before="0" w:after="100"/>
+        <w:jc w:val="both"/>
+      </w:pPr>
+      <w:r>
+        <w:rPr>
+          <w:rFonts w:ascii="Calibri" w:hAnsi="Calibri"/>
+          <w:b w:val="0"/>
+          <w:i w:val="0"/>
+          <w:sz w:val="20"/>
+        </w:rPr>
+        <w:t>En 11 horas observadas y 44 de la serie completada el PM2.5 medido es ligeramente mayor que el PM10, lo que es físicamente imposible y se debe a la incertidumbre de los equipos de medición. Son pocas horas y se conservaron en el análisis.</w:t>
+      </w:r>
+    </w:p>
+    <w:p>
+      <w:pPr>
+        <w:keepNext/>
+        <w:spacing w:before="140" w:after="60"/>
+        <w:jc w:val="left"/>
+      </w:pPr>
+      <w:r>
+        <w:rPr>
+          <w:rFonts w:ascii="Calibri" w:hAnsi="Calibri"/>
+          <w:b/>
+          <w:i w:val="0"/>
+          <w:color w:val="1F497D"/>
+          <w:sz w:val="22"/>
+        </w:rPr>
+        <w:t>3.6 Ciclo diario</w:t>
+      </w:r>
+    </w:p>
+    <w:p>
+      <w:pPr>
+        <w:keepNext/>
+        <w:spacing w:before="0" w:after="100"/>
+        <w:jc w:val="both"/>
+      </w:pPr>
+      <w:r>
+        <w:rPr>
+          <w:rFonts w:ascii="Calibri" w:hAnsi="Calibri"/>
+          <w:b w:val="0"/>
+          <w:i w:val="0"/>
+          <w:sz w:val="20"/>
+        </w:rPr>
+        <w:t>La Figura 6 compara el perfil horario promedio de cada contaminante, dividido entre su propio promedio para poder verlos en la misma escala. Solo se usaron horas con NO₂ observado, para que el perfil no dependa de la imputación.</w:t>
+      </w:r>
+    </w:p>
+    <w:p>
+      <w:pPr>
+        <w:keepNext/>
+        <w:jc w:val="center"/>
+      </w:pPr>
+      <w:r>
+        <w:drawing>
+          <wp:inline xmlns:a="http://schemas.openxmlformats.org/drawingml/2006/main" xmlns:pic="http://schemas.openxmlformats.org/drawingml/2006/picture">
+            <wp:extent cx="5669280" cy="2346834"/>
+            <wp:docPr id="7" name="Picture 7"/>
+            <wp:cNvGraphicFramePr>
+              <a:graphicFrameLocks noChangeAspect="1"/>
+            </wp:cNvGraphicFramePr>
+            <a:graphic>
+              <a:graphicData uri="http://schemas.openxmlformats.org/drawingml/2006/picture">
+                <pic:pic>
+                  <pic:nvPicPr>
+                    <pic:cNvPr id="0" name="ciclo_diario.png"/>
+                    <pic:cNvPicPr/>
+                  </pic:nvPicPr>
+                  <pic:blipFill>
+                    <a:blip r:embed="rId14"/>
+                    <a:stretch>
+                      <a:fillRect/>
+                    </a:stretch>
+                  </pic:blipFill>
+                  <pic:spPr>
+                    <a:xfrm>
+                      <a:off x="0" y="0"/>
+                      <a:ext cx="5669280" cy="2346834"/>
+                    </a:xfrm>
+                    <a:prstGeom prst="rect"/>
+                  </pic:spPr>
+                </pic:pic>
+              </a:graphicData>
+            </a:graphic>
+          </wp:inline>
+        </w:drawing>
+      </w:r>
+    </w:p>
+    <w:p>
+      <w:pPr>
+        <w:keepNext w:val="0"/>
+        <w:spacing w:before="40" w:after="160"/>
+        <w:jc w:val="center"/>
+      </w:pPr>
+      <w:r>
+        <w:rPr>
+          <w:rFonts w:ascii="Calibri" w:hAnsi="Calibri"/>
+          <w:b w:val="0"/>
+          <w:i/>
+          <w:color w:val="404040"/>
+          <w:sz w:val="18"/>
+        </w:rPr>
+        <w:t>Figura 6. Ciclo diario promedio del NO₂, el PM10, el PM2.5 y el CO, expresado como proporción del promedio de cada variable, estación Centro, septiembre a diciembre de 2024.</w:t>
+      </w:r>
+    </w:p>
+    <w:p>
+      <w:pPr>
+        <w:keepNext w:val="0"/>
+        <w:spacing w:before="0" w:after="100"/>
+        <w:jc w:val="both"/>
+      </w:pPr>
+      <w:r>
+        <w:rPr>
+          <w:rFonts w:ascii="Calibri" w:hAnsi="Calibri"/>
+          <w:b w:val="0"/>
+          <w:i w:val="0"/>
+          <w:sz w:val="20"/>
+        </w:rPr>
+        <w:t>Los cuatro contaminantes siguen el mismo patrón general: suben en la mañana, alrededor de las 7 y 8 horas, caen durante el mediodía y la tarde, y vuelven a subir a partir de las 18 o 19 horas hasta la noche. El NO₂ alcanza su mínimo a las 15 horas y su máximo a las 20 horas, con una concentración 3.9 veces mayor. Los picos coinciden con las horas de mayor tránsito, y el descenso del mediodía con el crecimiento de la capa de mezcla de la atmósfera, que diluye los contaminantes cuando el sol calienta el suelo. En el NO₂ la caída es más pronunciada que en las partículas porque, además, en esas horas se consume en las reacciones fotoquímicas que forman ozono. Este ciclo compartido es la explicación más directa de la correlación entre el NO₂ y las partículas: ambos responden a la misma actividad vehicular y a las mismas condiciones de dispersión, sin que uno cause al otro.</w:t>
+      </w:r>
+    </w:p>
+    <w:p>
+      <w:pPr>
+        <w:keepNext/>
         <w:spacing w:before="200" w:after="60"/>
         <w:jc w:val="left"/>
       </w:pPr>
@@ -4966,7 +5511,7 @@
           <w:i w:val="0"/>
           <w:sz w:val="20"/>
         </w:rPr>
-        <w:t>El NO₂ mantiene una relación positiva y moderada con las partículas, algo mayor con el PM10. La relación más fuerte entre las variables analizadas es la del PM10 con el PM2.5, y esa colinealidad condiciona el modelo múltiple: con los datos observados, el PM2.5 deja de ser significativo cuando se incluye el PM10 y no mejora el ajuste. Para explicar el NO₂ con partículas basta con el PM10, y un modelo con ambas no aporta información adicional. La aparente contribución del PM2.5 en la serie completada se explica en buena parte por la imputación con CO.</w:t>
+        <w:t>El NO₂ mantiene una relación positiva y moderada con las partículas, algo mayor con el PM10. La relación más fuerte entre las variables analizadas es la del PM10 con el PM2.5, y esa colinealidad condiciona el modelo múltiple: con los datos observados, el PM2.5 deja de ser significativo cuando se incluye el PM10 y no mejora el ajuste. Separar el PM10 en fracción fina y fracción gruesa resuelve el problema: con dos variables que ya no se traslapan, ambas resultan significativas y se relacionan con el NO₂ en magnitud parecida, con una ventaja moderada de la fracción fina. El ciclo diario muestra por qué: el NO₂ y las partículas suben con el tránsito de la mañana y la noche y bajan juntos al mediodía, cuando la atmósfera dispersa mejor los contaminantes.</w:t>
       </w:r>
     </w:p>
     <w:p>

</xml_diff>

<commit_message>
Tarea 1.6: rewrite prose in a more natural first-person student voice
</commit_message>
<xml_diff>
--- a/3er-semestre/visualizacion-grandes-bases-datos/tareas/Tarea1_6/Tarea1_6_VisualizacionGBD_CarlosPulidoRosas.docx
+++ b/3er-semestre/visualizacion-grandes-bases-datos/tareas/Tarea1_6/Tarea1_6_VisualizacionGBD_CarlosPulidoRosas.docx
@@ -559,7 +559,7 @@
           <w:i w:val="0"/>
           <w:sz w:val="20"/>
         </w:rPr>
-        <w:t>La estación Centro del Sistema de Monitoreo Atmosférico de Jalisco (SIMAJ) solo registra dióxido de nitrógeno (NO₂) de septiembre a diciembre de 2024: de las 8,784 horas del año, 6,078 (69.2 %) carecen de lectura. Esta tarea tiene dos partes. Primero, se completan los valores faltantes del NO₂ con los modelos de regresión lineal simple construidos en las tareas 1.4 y 1.5. Después, con la serie completada, se explora la relación del NO₂ con las partículas PM10 y PM2.5 mediante gráficas de dispersión entre la variable dependiente y cada variable independiente, gráficas entre las propias variables independientes para detectar colinealidad y modelos de regresión lineal múltiple representados como planos y superficies, siguiendo lo visto en la sesión 8.</w:t>
+        <w:t>En la estación Centro del SIMAJ el dióxido de nitrógeno (NO₂) solo se midió de septiembre a diciembre de 2024. De las 8,784 horas del año, a 6,078 les falta el dato (69.2 %). En esta tarea primero completé esos valores con los modelos de regresión lineal simple de las tareas 1.4 y 1.5 y después, con la serie ya completa, revisé cómo se relaciona el NO₂ con las partículas PM10 y PM2.5. Para la segunda parte seguí lo visto en la sesión 8: gráficas del NO₂ contra cada partícula, gráficas de las partículas entre sí para buscar colinealidad y modelos de regresión múltiple, que se pueden ver como un plano o una superficie.</w:t>
       </w:r>
     </w:p>
     <w:p>
@@ -609,7 +609,7 @@
           <w:i w:val="0"/>
           <w:sz w:val="20"/>
         </w:rPr>
-        <w:t>En las tareas anteriores el NOx tuvo la correlación más alta con el NO₂, pero no puede usarse para imputar por dos razones: contiene al NO₂ en su cálculo y le faltan exactamente las mismas horas, porque ambos se miden con el mismo analizador. El CO es el contaminante independiente con mayor correlación (r = 0.909 en la Tarea 1.5) y además tiene cobertura casi anual. Con él se pueden imputar 5,711 de las 6,078 horas faltantes; las 367 restantes tampoco tienen lectura de CO y se dejaron sin imputar, para no encadenar una estimación sobre otra.</w:t>
+        <w:t>El NOx fue el contaminante con mayor correlación en las tareas anteriores, pero no sirve para imputar. Por un lado incluye al NO₂ en su cálculo, y por otro le faltan las mismas horas, ya que los dos salen del mismo analizador. Por eso usé el CO, que fue el siguiente con mayor correlación (r = 0.909 en la Tarea 1.5) y que se midió casi todo el año. Con él se pueden completar 5,711 de las 6,078 horas faltantes. Las otras 367 tampoco tienen CO y las dejé vacías, porque estimarlas a partir de otra estimación ya no tendría mucho sentido.</w:t>
       </w:r>
     </w:p>
     <w:p>
@@ -625,7 +625,7 @@
           <w:i w:val="0"/>
           <w:sz w:val="20"/>
         </w:rPr>
-        <w:t>El vacío no es exclusivo de esta estación. De las 13 estaciones de la red SIMAJ en la base de 2024, 12 registran NO₂ y ninguna lo hace antes de agosto, de modo que el hueco de enero a julio afecta a toda la red. Esto justifica estimar los valores faltantes a partir de otro contaminante, pero también impide validar la imputación contra una estación vecina.</w:t>
+        <w:t>Revisé también las demás estaciones. De las 13 que tiene la base, 12 miden NO₂, y en ninguna hay datos antes de agosto. El hueco de enero a julio es de toda la red, así que no hay una estación vecina contra la cual comparar los valores imputados.</w:t>
       </w:r>
     </w:p>
     <w:p>
@@ -658,7 +658,7 @@
           <w:i w:val="0"/>
           <w:sz w:val="20"/>
         </w:rPr>
-        <w:t>Se evaluaron los dos modelos simples del NO₂ en función del CO: el de la Tarea 1.4, con intercepto y ajustado con todas las horas (NO₂ = 0.0084 + 0.0132·CO), y el de la Tarea 1.5, que cruza por el origen y se ajustó sin valores atípicos (NO₂ = 0.0279·CO). La Tabla 1 compara sus errores sobre las horas en que el NO₂ sí se observó, separando las horas con CO dentro y fuera de la cerca superior de Tukey (2.128 ppm), que es el límite del rango con el que se estimó el modelo 1.5.</w:t>
+        <w:t>Comparé los dos modelos simples del NO₂ en función del CO. El de la Tarea 1.4 tiene intercepto y se ajustó con todas las horas (NO₂ = 0.0084 + 0.0132·CO). El de la Tarea 1.5 pasa por el origen y se ajustó sin atípicos (NO₂ = 0.0279·CO). En la Tabla 1 están sus errores en las horas donde sí hay NO₂, separando las horas con CO por debajo y por encima de la cerca de Tukey (2.128 ppm), que marca el rango con el que se estimó el modelo 1.5.</w:t>
       </w:r>
     </w:p>
     <w:tbl>
@@ -1342,6 +1342,22 @@
     </w:p>
     <w:p>
       <w:pPr>
+        <w:keepNext w:val="0"/>
+        <w:spacing w:before="0" w:after="100"/>
+        <w:jc w:val="both"/>
+      </w:pPr>
+      <w:r>
+        <w:rPr>
+          <w:rFonts w:ascii="Calibri" w:hAnsi="Calibri"/>
+          <w:b w:val="0"/>
+          <w:i w:val="0"/>
+          <w:sz w:val="20"/>
+        </w:rPr>
+        <w:t>Con CO normal, el modelo 1.5 se equivoca menos (RMSE de 0.0060 contra 0.0076 ppm). El problema aparece cuando el CO pasa de la cerca. Ahí la recta sigue subiendo, pero el NO₂ real ya no, porque la relación se aplana en valores altos (lo mismo que se vio en la Tarea 1.4), y el modelo termina sobrestimando el NO₂ en 0.044 ppm en promedio. El modelo 1.4 tiene menos pendiente y en ese tramo falla mucho menos.</w:t>
+      </w:r>
+    </w:p>
+    <w:p>
+      <w:pPr>
         <w:keepNext/>
         <w:spacing w:before="0" w:after="100"/>
         <w:jc w:val="both"/>
@@ -1353,7 +1369,7 @@
           <w:i w:val="0"/>
           <w:sz w:val="20"/>
         </w:rPr>
-        <w:t>Ninguno de los dos modelos es mejor en todo el rango. Dentro de la cerca, el modelo 1.5 tiene menos error que el 1.4 (RMSE de 0.0060 frente a 0.0076 ppm). Fuera de ella, sin embargo, extrapola una recta que nunca vio esas concentraciones y sobrestima el NO₂ en 0.044 ppm en promedio, porque la relación real es cóncava y se aplana en los valores altos, como se observó en la Tarea 1.4. El modelo 1.4, al estimarse con todas las horas, tiene una pendiente menor y se equivoca mucho menos en ese tramo. A partir de esto se probaron dos reglas. La primera combina ambos modelos: el 1.5 cuando el CO no rebasa la cerca y el 1.4 cuando la rebasa. La segunda usa solo el modelo 1.5 dentro del rango en el que fue estimado: cuando el CO supera la cerca, el NO₂ estimado se mantiene en el valor que el modelo da en la cerca (0.0593 ppm), en lugar de prolongar la recta.</w:t>
+        <w:t>Con eso en mente probé dos reglas más. La primera combina los modelos: el 1.5 hasta la cerca y el 1.4 de ahí en adelante. La segunda usa solo el 1.5, pero sin dejar que se salga de su rango: si el CO rebasa la cerca, el NO₂ se queda en el valor que el modelo da justo en ella (0.0593 ppm).</w:t>
       </w:r>
     </w:p>
     <w:p>
@@ -1426,7 +1442,7 @@
           <w:i w:val="0"/>
           <w:sz w:val="20"/>
         </w:rPr>
-        <w:t>Con los mismos datos con los que se estimaron, la regla combinada obtiene el menor error (RMSE de 0.0074 ppm, frente a 0.0075 del modelo acotado), pero tiene un salto en la cerca: al pasar de un modelo a otro, el NO₂ estimado cae de 0.059 a 0.036 ppm, algo que no tiene sentido físico. La validación fuera de muestra, en la que los modelos se reestiman con septiembre y octubre y se aplican a noviembre y diciembre, resuelve la elección. Los tres esquemas que prolongan una recta tienen errores parecidos y altos (RMSE cercano a 0.019 ppm), mientras que el modelo 1.5 acotado reduce el error a 0.0088 ppm, menos de la mitad. Cuando el CO alcanza valores que el modelo no conoce, es más seguro no extrapolar. Por eso se adoptó el modelo 1.5 acotado para la imputación. Aun así, la relación entre el NO₂ y el CO cambia de un mes a otro, por lo que los valores imputados deben tomarse como una aproximación y no como mediciones.</w:t>
+        <w:t>Medida con los mismos datos del ajuste, la regla combinada sale un poco mejor (RMSE de 0.0074 contra 0.0075 ppm). Sin embargo, tiene un salto en la cerca: el NO₂ estimado baja de golpe de 0.059 a 0.036 ppm, lo cual no tiene explicación física. Para decidir hice una prueba fuera de muestra: reajusté los modelos solo con septiembre y octubre y los apliqué a noviembre y diciembre. Las tres opciones que prolongan una recta quedaron con errores parecidos, alrededor de 0.019 ppm, y el modelo acotado bajó a 0.0088 ppm. Por eso me quedé con el modelo 1.5 acotado. La prueba también deja ver que la relación entre el NO₂ y el CO no es igual todos los meses, así que los valores imputados hay que leerlos como una aproximación.</w:t>
       </w:r>
     </w:p>
     <w:p>
@@ -1459,7 +1475,7 @@
           <w:i w:val="0"/>
           <w:sz w:val="20"/>
         </w:rPr>
-        <w:t>Se imputaron 5,711 horas; en 446 de ellas el CO superaba la cerca y el NO₂ se fijó en el valor del límite. La Figura 2 muestra la serie diaria resultante y la Tabla 2 los promedios mensuales.</w:t>
+        <w:t>En total se imputaron 5,711 horas. En 446 de ellas el CO estaba por encima de la cerca y el NO₂ se quedó en el valor límite. La Figura 2 muestra la serie diaria y la Tabla 2 los promedios por mes.</w:t>
       </w:r>
     </w:p>
     <w:p>
@@ -2952,7 +2968,7 @@
           <w:i w:val="0"/>
           <w:sz w:val="20"/>
         </w:rPr>
-        <w:t>En septiembre a diciembre los promedios casi no cambian, porque solo se completaron 222 horas sueltas. De enero a agosto toda la información proviene del CO. El patrón que resulta es razonable: el promedio más alto se da en enero (0.0409 ppm) y desciende hacia el verano, lo que coincide con la temporada seca e invernal, en la que las inversiones térmicas dificultan la dispersión de los contaminantes en Guadalajara, y con la temporada de lluvias, que la favorece. Aun así, ese comportamiento es heredado del CO y no puede verificarse, porque no existen mediciones de NO₂ en esos meses.</w:t>
+        <w:t>De septiembre a diciembre los promedios casi no se mueven, porque ahí solo se rellenaron 222 horas sueltas. De enero a agosto, en cambio, todo viene del CO. El resultado se ve lógico: enero tiene el promedio más alto (0.0409 ppm) y los valores bajan hacia el verano. Eso cuadra con lo que pasa en Guadalajara, donde en los meses secos las inversiones térmicas atrapan los contaminantes y en la temporada de lluvias se dispersan mejor. Aun así, este patrón viene del CO y no hay mediciones de NO₂ en esos meses para confirmarlo.</w:t>
       </w:r>
     </w:p>
     <w:p>
@@ -3002,7 +3018,7 @@
           <w:i w:val="0"/>
           <w:sz w:val="20"/>
         </w:rPr>
-        <w:t>Las partículas suspendidas, o material particulado (PM, por sus siglas en inglés), son una mezcla de partículas sólidas y gotas líquidas que permanecen en el aire. Se clasifican por su diámetro aerodinámico: el PM10 agrupa a las partículas de 10 µm o menos y el PM2.5 a las de 2.5 µm o menos, unas treinta veces más delgadas que un cabello humano. Por definición, el PM2.5 es una fracción del PM10; la diferencia entre ambos corresponde a la llamada fracción gruesa, de entre 2.5 y 10 µm. A diferencia del NO₂ o del CO, que son gases, ambas se miden en masa por volumen de aire (µg/m³) (Seinfeld y Pandis, 2016).</w:t>
+        <w:t>El material particulado (PM) es la mezcla de partículas sólidas y gotitas que quedan suspendidas en el aire. Se clasifica por tamaño. El PM10 son las partículas de 10 µm o menos y el PM2.5 las de 2.5 µm o menos, unas treinta veces más delgadas que un cabello. El PM2.5 forma parte del PM10, y lo que queda entre los dos (partículas de 2.5 a 10 µm) se conoce como fracción gruesa. A diferencia del NO₂ y del CO, que son gases, las partículas se miden en µg/m³ (Seinfeld y Pandis, 2016).</w:t>
       </w:r>
     </w:p>
     <w:p>
@@ -3018,7 +3034,7 @@
           <w:i w:val="0"/>
           <w:sz w:val="20"/>
         </w:rPr>
-        <w:t>Sus fuentes son distintas. La fracción gruesa proviene sobre todo de procesos mecánicos: polvo resuspendido por el viento y el tránsito en calles sin pavimentar, construcción, erosión del suelo y desgaste de llantas y frenos. El PM2.5, en cambio, se origina principalmente en la combustión (motores, en particular los de diésel, quemas agrícolas e industria) y en la formación secundaria, es decir, en partículas que se forman en la atmósfera a partir de gases precursores. Entre esos precursores están los óxidos de nitrógeno: el NO₂ se oxida a ácido nítrico, que al reaccionar con el amoniaco forma nitrato de amonio, una sal que pasa a formar parte del PM2.5 (Seinfeld y Pandis, 2016). Por eso se espera que el NO₂ se relacione con las partículas finas a través de dos vías: la fuente vehicular que comparten y la química atmosférica.</w:t>
+        <w:t>Las dos fracciones vienen de fuentes distintas. La gruesa se genera sobre todo por procesos mecánicos, como el polvo que levantan el viento y los coches, la construcción o el desgaste de llantas y frenos. El PM2.5 sale principalmente de la combustión, en especial de motores diésel, aunque una parte se forma en la propia atmósfera. Ahí entra el NO₂, que se oxida a ácido nítrico y, al reaccionar con amoniaco, forma nitrato de amonio, que termina como PM2.5 (Seinfeld y Pandis, 2016). Por lo tanto, se esperaría encontrar alguna relación entre el NO₂ y las partículas finas, tanto por la fuente vehicular que comparten como por esta química.</w:t>
       </w:r>
     </w:p>
     <w:p>
@@ -3034,7 +3050,7 @@
           <w:i w:val="0"/>
           <w:sz w:val="20"/>
         </w:rPr>
-        <w:t>Su efecto en la salud depende del tamaño. El PM10 llega a las vías respiratorias superiores y a los bronquios, mientras que el PM2.5 alcanza los alvéolos pulmonares y puede pasar al torrente sanguíneo, por lo que se asocia con enfermedades respiratorias, cardiovasculares y con mortalidad prematura. La Organización Mundial de la Salud (OMS, 2021) recomienda que el promedio de 24 horas no rebase 45 µg/m³ de PM10 ni 15 µg/m³ de PM2.5. En la estación Centro, durante 2024, el PM10 promedió 40.1 µg/m³ y el PM2.5 17.1 µg/m³; el promedio diario superó la recomendación de la OMS en 123 de 350 días para el PM10 y en 155 de 336 días para el PM2.5. La mediana del cociente PM2.5/PM10 es de 0.41, lo que indica que algo menos de la mitad de la masa de partículas en esta estación corresponde a la fracción fina.</w:t>
+        <w:t>En la salud, el tamaño importa. El PM10 llega hasta los bronquios y el PM2.5 entra a los alvéolos y puede pasar a la sangre, por lo que se asocia con enfermedades respiratorias y cardiovasculares. La OMS (2021) recomienda no pasar de 45 µg/m³ de PM10 ni de 15 µg/m³ de PM2.5 en promedio de 24 horas. En la estación Centro, en 2024, el PM10 promedió 40.1 µg/m³ y el PM2.5 17.1 µg/m³. El promedio diario rebasó la recomendación en 123 de 350 días para el PM10 y en 155 de 336 para el PM2.5. Además, la mediana del cociente PM2.5/PM10 fue de 0.41; es decir, en esta estación algo menos de la mitad de la masa de partículas es fracción fina.</w:t>
       </w:r>
     </w:p>
     <w:p>
@@ -3067,7 +3083,7 @@
           <w:i w:val="0"/>
           <w:sz w:val="20"/>
         </w:rPr>
-        <w:t>Para el análisis se tomaron las horas con NO₂ (observado o imputado), PM10 y PM2.5 al mismo tiempo (6,752) y, como en la Tarea 1.5, se excluyeron las horas atípicas en cualquiera de las tres variables según el criterio de Tukey, con lo que quedaron 6,260 horas, 3,878 de ellas con NO₂ imputado. Como control, todos los modelos se estimaron también con las horas de NO₂ observado únicamente (2,395 horas tras la misma depuración).</w:t>
+        <w:t>Tomé las horas que tienen NO₂ (medido o imputado), PM10 y PM2.5 al mismo tiempo, que son 6,752. Igual que en la Tarea 1.5, quité las horas atípicas en cualquiera de las tres variables con el criterio de Tukey, y quedaron 6,260, de las cuales 3,878 tienen NO₂ imputado. Para tener una referencia, repetí todos los modelos usando solo las horas con NO₂ medido (2,395 después de la misma limpieza).</w:t>
       </w:r>
     </w:p>
     <w:p>
@@ -3100,7 +3116,7 @@
           <w:i w:val="0"/>
           <w:sz w:val="20"/>
         </w:rPr>
-        <w:t>La Figura 3 sigue la técnica de la sesión 8: se grafica la variable dependiente contra cada variable independiente y, además, las variables independientes entre sí. La Tabla 3 reúne los coeficientes de correlación.</w:t>
+        <w:t>Siguiendo la sesión 8, la Figura 3 muestra el NO₂ contra cada partícula y, en el tercer panel, las dos partículas entre sí. Los coeficientes de correlación están en la Tabla 3.</w:t>
       </w:r>
     </w:p>
     <w:p>
@@ -3531,7 +3547,7 @@
           <w:i w:val="0"/>
           <w:sz w:val="20"/>
         </w:rPr>
-        <w:t>El NO₂ se relaciona de forma positiva y moderada con ambas partículas, un poco más con el PM10. La relación más fuerte de la tabla, sin embargo, no es la del NO₂ sino la de las partículas entre sí (r = 0.815 en la serie completada y 0.876 con datos observados). No es casual: el PM10 incluye a todas las partículas menores de 10 µm y, por lo tanto, al PM2.5. Las dos variables independientes aportan en buena medida la misma información, que es justamente la colinealidad que la sesión 8 recomienda revisar antes de ajustar un modelo múltiple. El factor de inflación de la varianza (VIF = 1 / (1 − R²ⱼ)) es de 2.97 y 4.31: no llega al umbral de 5 o 10 que suele considerarse grave, pero indica que la varianza de cada coeficiente se multiplica por tres o cuatro por compartir información con la otra partícula.</w:t>
+        <w:t>El NO₂ tiene una correlación positiva y moderada con las dos partículas, un poco mayor con el PM10. Lo que más destaca, sin embargo, es la correlación entre las partículas mismas (r = 0.815 en la serie completada y 0.876 con los datos medidos). Se explica porque el PM10 contiene al PM2.5, y significa que las dos variables independientes traen en buena parte la misma información, que es la colinealidad que hay que revisar antes de un modelo múltiple. El VIF, calculado como 1 / (1 − R²ⱼ), fue de 2.97 y 4.31. No llega a 5 o 10, que es donde normalmente se considera grave, pero sí quiere decir que la varianza de cada coeficiente se multiplica por tres o cuatro.</w:t>
       </w:r>
     </w:p>
     <w:p>
@@ -3564,7 +3580,7 @@
           <w:i w:val="0"/>
           <w:sz w:val="20"/>
         </w:rPr>
-        <w:t>Se ajustaron cuatro modelos por mínimos cuadrados: los dos simples, el lineal múltiple NO₂ = b₀ + b₁·PM10 + b₂·PM2.5 y un modelo cuadrático en el PM10, NO₂ = b₀ + b₁·PM10 + b₂·PM10² + b₃·PM2.5, como el de la sesión 8. Los resultados se presentan en la Tabla 4 y los planos de regresión en la Figura 4.</w:t>
+        <w:t>Ajusté cuatro modelos por mínimos cuadrados: los dos simples, el múltiple NO₂ = b₀ + b₁·PM10 + b₂·PM2.5 y uno cuadrático en el PM10, NO₂ = b₀ + b₁·PM10 + b₂·PM10² + b₃·PM2.5, parecido al ejemplo de la sesión 8. Los resultados están en la Tabla 4 y los planos en la Figura 4.</w:t>
       </w:r>
     </w:p>
     <w:tbl>
@@ -4828,7 +4844,7 @@
           <w:i w:val="0"/>
           <w:sz w:val="20"/>
         </w:rPr>
-        <w:t>Los coeficientes se leen como el cambio esperado en el NO₂ por cada µg/m³ adicional de partículas. Con los datos observados, un aumento de 10 µg/m³ de PM10 se asocia con 3.5 ppb más de NO₂, y uno de 10 µg/m³ de PM2.5 con 7.2 ppb, frente a un promedio de 18.3 ppb de NO₂ en esas horas. El coeficiente del PM2.5 es mayor porque sus concentraciones son más bajas, de modo que 10 µg/m³ representan un cambio relativo más grande. Estas cifras no significan que las partículas produzcan NO₂: ambas variables aumentan juntas porque comparten fuentes de combustión y porque se acumulan bajo las mismas condiciones meteorológicas, como las inversiones térmicas y la falta de viento.</w:t>
+        <w:t>Cada coeficiente indica cuánto cambia el NO₂ por cada µg/m³ más de partículas. Con los datos medidos, 10 µg/m³ más de PM10 van con 3.5 ppb más de NO₂, y 10 µg/m³ más de PM2.5 con 7.2 ppb. Como referencia, el NO₂ promedio en esas horas es de 18.3 ppb. El coeficiente del PM2.5 sale más grande porque sus niveles son más bajos y 10 µg/m³ pesan más en términos relativos. Esto no quiere decir que las partículas generen NO₂. Lo que pasa es que los dos suben juntos, porque tienen fuentes de combustión en común y se acumulan con el mismo clima, como las inversiones térmicas o los días sin viento.</w:t>
       </w:r>
     </w:p>
     <w:p>
@@ -4844,7 +4860,7 @@
           <w:i w:val="0"/>
           <w:sz w:val="20"/>
         </w:rPr>
-        <w:t>Con los datos observados, agregar el PM2.5 a un modelo que ya contiene al PM10 no mejora el ajuste (R² de 0.365 en ambos casos) y el coeficiente del PM2.5 se vuelve no significativo (p = 0.12), aunque en el modelo simple sí lo era. Es el síntoma típico de la colinealidad: una vez que el PM10 está en el modelo, el PM2.5 ya no aporta información propia sobre el NO₂. La Figura 5 lo muestra con claridad: el coeficiente del PM2.5 pasa de 0.721 a 0.069 ppb por µg/m³ y su intervalo de confianza incluye el cero.</w:t>
+        <w:t>En los datos medidos, meter el PM2.5 a un modelo que ya tiene al PM10 no mejora nada (R² de 0.365 en los dos casos) y su coeficiente deja de ser significativo (p = 0.12), aunque en el modelo simple sí lo era. Es el efecto clásico de la colinealidad. En la Figura 5 se ve bien: el coeficiente del PM2.5 baja de 0.721 a 0.069 ppb por µg/m³ y su intervalo de confianza toca el cero.</w:t>
       </w:r>
     </w:p>
     <w:p>
@@ -4917,7 +4933,7 @@
           <w:i w:val="0"/>
           <w:sz w:val="20"/>
         </w:rPr>
-        <w:t>En la serie completada ambos coeficientes son significativos y el R² sube de 0.291 a 0.317. Esta diferencia debe interpretarse con cuidado. Las horas imputadas no contienen mediciones de NO₂, sino una función lineal del CO, de modo que en esos meses el modelo mide en realidad la relación entre el CO y las partículas, que es más pareja entre el PM10 y el PM2.5 porque ambos comparten la combustión como fuente. Parte de la información que el PM2.5 parece aportar proviene, entonces, de la imputación y no de los datos observados.</w:t>
+        <w:t>En la serie completada pasa algo distinto: los dos coeficientes son significativos y el R² sube de 0.291 a 0.317. Creo que esto se debe sobre todo a la imputación. En las horas imputadas el NO₂ no es una medición sino una función del CO, así que en esos meses el modelo está midiendo en realidad cómo se relaciona el CO con las partículas. Como el CO también viene de la combustión, se relaciona de forma más pareja con el PM10 y el PM2.5, y eso le da al PM2.5 un peso que no tiene en los datos medidos.</w:t>
       </w:r>
     </w:p>
     <w:p>
@@ -4933,7 +4949,7 @@
           <w:i w:val="0"/>
           <w:sz w:val="20"/>
         </w:rPr>
-        <w:t>Por último, el término cuadrático no mejora el ajuste en ninguna de las dos series (p = 0.70 y 0.95), y la superficie de la Figura 4 es prácticamente un plano. A diferencia de lo que ocurría con el NOx y el CO, la relación del NO₂ con las partículas no muestra una curvatura relevante una vez excluidos los atípicos. Lo que limita el ajuste es la dispersión de los puntos: las dos partículas juntas explican apenas 31.7 % de la variabilidad del NO₂ en la serie completada.</w:t>
+        <w:t>El término cuadrático no aportó nada en ninguna serie (p = 0.70 y 0.95), y en la Figura 4 la superficie casi no se curva. Con el NOx y el CO sí había curvatura, pero con las partículas, ya sin atípicos, la relación es prácticamente lineal. Lo que limita el modelo es la dispersión de los puntos: entre las dos partículas explican 31.7 % de la variabilidad del NO₂ en la serie completada.</w:t>
       </w:r>
     </w:p>
     <w:p>
@@ -4966,7 +4982,7 @@
           <w:i w:val="0"/>
           <w:sz w:val="20"/>
         </w:rPr>
-        <w:t>La colinealidad entre el PM10 y el PM2.5 tiene una causa conocida: el PM10 contiene al PM2.5. Por eso puede eliminarse sin quitar información, separando el PM10 en sus dos componentes, la fracción fina (PM2.5) y la fracción gruesa (PM10 − PM2.5), y ajustando NO₂ = b₀ + b₁·PM2.5 + b₂·(PM10 − PM2.5). Este modelo tiene exactamente el mismo ajuste que el lineal múltiple de la Tabla 4, porque usa la misma información, pero sus dos variables ya no comparten partículas. La correlación entre ellas baja a 0.677 con datos observados y el VIF a 1.84 (Tabla 5).</w:t>
+        <w:t>Como la colinealidad viene de que el PM10 contiene al PM2.5, se puede quitar separando el PM10 en sus dos partes, la fracción fina (PM2.5) y la gruesa (PM10 − PM2.5), y ajustando NO₂ = b₀ + b₁·PM2.5 + b₂·(PM10 − PM2.5). El ajuste es el mismo que el del modelo múltiple de la Tabla 4, porque la información es la misma, pero ahora las dos variables ya no comparten partículas. Su correlación baja a 0.677 en los datos medidos y el VIF a 1.84 (Tabla 5).</w:t>
       </w:r>
     </w:p>
     <w:tbl>
@@ -5340,7 +5356,7 @@
           <w:i w:val="0"/>
           <w:sz w:val="20"/>
         </w:rPr>
-        <w:t>Con la colinealidad resuelta, los dos coeficientes son significativos y sus intervalos de confianza son estrechos. En los datos observados, cada µg/m³ de partículas finas se asocia con 0.392 ppb de NO₂ y cada µg/m³ de partículas gruesas con 0.323 ppb. Ambas fracciones se relacionan con el NO₂ en magnitud parecida, con una ventaja moderada de la fina, coherente con su origen en la combustión. Este resultado precisa la lectura de la sección anterior: que el PM2.5 dejara de ser significativo junto al PM10 no significa que las partículas finas no se relacionen con el NO₂, sino que no lo hacen mucho más que las gruesas. El coeficiente del PM2.5 en el modelo con PM10 mide justamente esa diferencia entre ambas fracciones. En la serie completada la ventaja de la fracción fina es mayor, lo que de nuevo refleja la imputación con CO, un gas de combustión.</w:t>
+        <w:t>Así, los dos coeficientes salen significativos y con intervalos estrechos. En los datos medidos, cada µg/m³ de partículas finas se asocia con 0.392 ppb de NO₂ y cada µg/m³ de gruesas con 0.323 ppb. Las dos fracciones se relacionan con el NO₂ más o menos igual, con algo de ventaja para la fina, lo cual tiene sentido si se piensa que viene de la combustión.</w:t>
       </w:r>
     </w:p>
     <w:p>
@@ -5356,7 +5372,23 @@
           <w:i w:val="0"/>
           <w:sz w:val="20"/>
         </w:rPr>
-        <w:t>En 11 horas observadas y 44 de la serie completada el PM2.5 medido es ligeramente mayor que el PM10, lo que es físicamente imposible y se debe a la incertidumbre de los equipos de medición. Son pocas horas y se conservaron en el análisis.</w:t>
+        <w:t>Esto cambia la forma de leer la sección anterior. Que el PM2.5 dejara de ser significativo junto al PM10 no quería decir que las partículas finas no tengan que ver con el NO₂, sino que no tienen mucho más que ver que las gruesas. En el modelo con PM10, el coeficiente del PM2.5 mide precisamente esa diferencia. En la serie completada la fracción fina sale con más ventaja, otra vez por efecto de la imputación con CO.</w:t>
+      </w:r>
+    </w:p>
+    <w:p>
+      <w:pPr>
+        <w:keepNext w:val="0"/>
+        <w:spacing w:before="0" w:after="100"/>
+        <w:jc w:val="both"/>
+      </w:pPr>
+      <w:r>
+        <w:rPr>
+          <w:rFonts w:ascii="Calibri" w:hAnsi="Calibri"/>
+          <w:b w:val="0"/>
+          <w:i w:val="0"/>
+          <w:sz w:val="20"/>
+        </w:rPr>
+        <w:t>Un detalle: en 11 horas medidas y 44 de la serie completada el PM2.5 aparece un poco mayor que el PM10, cosa que físicamente no puede pasar y que atribuyo a la incertidumbre de los equipos. Como son muy pocas, las dejé.</w:t>
       </w:r>
     </w:p>
     <w:p>
@@ -5389,7 +5421,7 @@
           <w:i w:val="0"/>
           <w:sz w:val="20"/>
         </w:rPr>
-        <w:t>La Figura 6 compara el perfil horario promedio de cada contaminante, dividido entre su propio promedio para poder verlos en la misma escala. Solo se usaron horas con NO₂ observado, para que el perfil no dependa de la imputación.</w:t>
+        <w:t>Por último, quise ver si los contaminantes siguen el mismo horario a lo largo del día. En la Figura 6 está el promedio de cada hora dividido entre el promedio general de cada contaminante, para poder compararlos en la misma escala. Usé solo las horas con NO₂ medido, para que la imputación no influyera.</w:t>
       </w:r>
     </w:p>
     <w:p>
@@ -5462,7 +5494,23 @@
           <w:i w:val="0"/>
           <w:sz w:val="20"/>
         </w:rPr>
-        <w:t>Los cuatro contaminantes siguen el mismo patrón general: suben en la mañana, alrededor de las 7 y 8 horas, caen durante el mediodía y la tarde, y vuelven a subir a partir de las 18 o 19 horas hasta la noche. El NO₂ alcanza su mínimo a las 15 horas y su máximo a las 20 horas, con una concentración 3.9 veces mayor. Los picos coinciden con las horas de mayor tránsito, y el descenso del mediodía con el crecimiento de la capa de mezcla de la atmósfera, que diluye los contaminantes cuando el sol calienta el suelo. En el NO₂ la caída es más pronunciada que en las partículas porque, además, en esas horas se consume en las reacciones fotoquímicas que forman ozono. Este ciclo compartido es la explicación más directa de la correlación entre el NO₂ y las partículas: ambos responden a la misma actividad vehicular y a las mismas condiciones de dispersión, sin que uno cause al otro.</w:t>
+        <w:t>Los cuatro siguen casi el mismo patrón. Suben en la mañana, hacia las 7 u 8, bajan durante el mediodía y la tarde, y vuelven a subir desde las 18 o 19 horas hasta la noche. El NO₂ llega a su mínimo a las 15 horas y a su máximo a las 20, cuando es 3.9 veces mayor. Los picos coinciden con las horas de más tráfico. La baja del mediodía se debe a que el sol calienta el suelo y la capa de mezcla de la atmósfera crece, lo que diluye los contaminantes. En el NO₂ la caída es más fuerte que en las partículas porque a esas horas, además, se consume en las reacciones que forman ozono.</w:t>
+      </w:r>
+    </w:p>
+    <w:p>
+      <w:pPr>
+        <w:keepNext w:val="0"/>
+        <w:spacing w:before="0" w:after="100"/>
+        <w:jc w:val="both"/>
+      </w:pPr>
+      <w:r>
+        <w:rPr>
+          <w:rFonts w:ascii="Calibri" w:hAnsi="Calibri"/>
+          <w:b w:val="0"/>
+          <w:i w:val="0"/>
+          <w:sz w:val="20"/>
+        </w:rPr>
+        <w:t>Este patrón compartido ayuda a entender la correlación entre el NO₂ y las partículas. Los dos responden al mismo tráfico y a las mismas condiciones de dispersión, sin que uno sea causa del otro.</w:t>
       </w:r>
     </w:p>
     <w:p>
@@ -5495,7 +5543,7 @@
           <w:i w:val="0"/>
           <w:sz w:val="20"/>
         </w:rPr>
-        <w:t>La imputación permitió completar 94.0 % de las horas sin NO₂ a partir del CO. Ninguno de los modelos de las tareas anteriores funcionó bien en todo el rango: la recta por el origen de la Tarea 1.5 es la más precisa en las concentraciones habituales, pero sobrestima el NO₂ cuando el CO es alto, porque prolonga una recta fuera del rango con el que fue estimada. Limitarla a ese rango fue la opción que mejor resistió la validación fuera de muestra, con menos de la mitad del error de las alternativas. Aun así, la relación entre ambos contaminantes cambia de un mes a otro, por lo que los ocho meses imputados son una aproximación que no puede contrastarse con mediciones.</w:t>
+        <w:t>Con el CO pude completar 94.0 % de las horas sin NO₂. Ninguno de los dos modelos anteriores funcionaba bien en todo el rango. La recta por el origen de la Tarea 1.5 es la más precisa con valores normales de CO, pero cuando el CO es alto sobrestima el NO₂, porque se sale del rango con que se ajustó. Limitarla a ese rango fue la opción que mejor aguantó la prueba fuera de muestra, con menos de la mitad del error de las otras. Aun así, la relación entre los dos contaminantes cambia de mes a mes, y los ocho meses imputados no se pueden comparar con mediciones reales.</w:t>
       </w:r>
     </w:p>
     <w:p>
@@ -5511,7 +5559,7 @@
           <w:i w:val="0"/>
           <w:sz w:val="20"/>
         </w:rPr>
-        <w:t>El NO₂ mantiene una relación positiva y moderada con las partículas, algo mayor con el PM10. La relación más fuerte entre las variables analizadas es la del PM10 con el PM2.5, y esa colinealidad condiciona el modelo múltiple: con los datos observados, el PM2.5 deja de ser significativo cuando se incluye el PM10 y no mejora el ajuste. Separar el PM10 en fracción fina y fracción gruesa resuelve el problema: con dos variables que ya no se traslapan, ambas resultan significativas y se relacionan con el NO₂ en magnitud parecida, con una ventaja moderada de la fracción fina. El ciclo diario muestra por qué: el NO₂ y las partículas suben con el tránsito de la mañana y la noche y bajan juntos al mediodía, cuando la atmósfera dispersa mejor los contaminantes.</w:t>
+        <w:t>El NO₂ tiene una relación positiva y moderada con las partículas, algo mayor con el PM10. La correlación más fuerte de todo el análisis, sin embargo, fue entre el PM10 y el PM2.5, y esa colinealidad hizo que, con los datos medidos, el PM2.5 dejara de ser significativo al agregar el PM10. Al separar el PM10 en fracción fina y gruesa el problema desaparece, y las dos fracciones resultan significativas y con un efecto parecido sobre el NO₂, un poco mayor en la fina.</w:t>
       </w:r>
     </w:p>
     <w:p>
@@ -5527,7 +5575,7 @@
           <w:i w:val="0"/>
           <w:sz w:val="20"/>
         </w:rPr>
-        <w:t>En términos generales, las partículas explican una fracción mucho menor del NO₂ que el CO o el NOx, lo que concuerda con que tienen fuentes más diversas (polvo, construcción, combustión, formación secundaria), mientras que el NO₂ depende sobre todo del tránsito vehicular. Como en las tareas anteriores, se trata de asociaciones estadísticas que no establecen relaciones de causalidad.</w:t>
+        <w:t>El ciclo diario explica buena parte de lo anterior, ya que el NO₂ y las partículas suben con el tráfico de la mañana y de la noche y bajan juntos al mediodía. Aun así, las partículas explican mucho menos del NO₂ que el CO o el NOx. Me parece razonable, porque además de la combustión tienen otras fuentes, como el polvo y la construcción, mientras que el NO₂ depende casi solo del tráfico.</w:t>
       </w:r>
     </w:p>
     <w:p>

</xml_diff>